<commit_message>
Add Introduction to BigQuery report
</commit_message>
<xml_diff>
--- a/M02-consumer-panel-report.docx
+++ b/M02-consumer-panel-report.docx
@@ -813,7 +813,7 @@
       </w:r>
     </w:p>
     <w:bookmarkEnd w:id="30"/>
-    <w:bookmarkStart w:id="31" w:name="lessons-for-my-research-project"/>
+    <w:bookmarkStart w:id="33" w:name="lessons-for-my-research-project"/>
     <w:p>
       <w:pPr>
         <w:pStyle w:val="Heading2"/>
@@ -998,7 +998,45 @@
         <w:t xml:space="preserve">Be careful about who is taking the survey. YouGov noted that the live results were unweighted and not representative of the population, which reminded me that a self-selected sample can look very different from the group we actually want to learn about.</w:t>
       </w:r>
     </w:p>
-    <w:bookmarkEnd w:id="31"/>
+    <w:p>
+      <w:pPr>
+        <w:pStyle w:val="FirstParagraph"/>
+      </w:pPr>
+      <w:r>
+        <w:t xml:space="preserve">Live page:</w:t>
+      </w:r>
+      <w:r>
+        <w:t xml:space="preserve"> </w:t>
+      </w:r>
+      <w:hyperlink r:id="rId31">
+        <w:r>
+          <w:rPr>
+            <w:rStyle w:val="Hyperlink"/>
+          </w:rPr>
+          <w:t xml:space="preserve">link</w:t>
+        </w:r>
+      </w:hyperlink>
+    </w:p>
+    <w:p>
+      <w:pPr>
+        <w:pStyle w:val="BodyText"/>
+      </w:pPr>
+      <w:r>
+        <w:t xml:space="preserve">GitHub repo:</w:t>
+      </w:r>
+      <w:r>
+        <w:t xml:space="preserve"> </w:t>
+      </w:r>
+      <w:hyperlink r:id="rId32">
+        <w:r>
+          <w:rPr>
+            <w:rStyle w:val="Hyperlink"/>
+          </w:rPr>
+          <w:t xml:space="preserve">link</w:t>
+        </w:r>
+      </w:hyperlink>
+    </w:p>
+    <w:bookmarkEnd w:id="33"/>
     <w:sectPr>
       <w:footnotePr>
         <w:numRestart w:val="eachSect"/>

</xml_diff>